<commit_message>
:books:docs:Criação do protótipo da página financeiro e pesquisa UXUI
</commit_message>
<xml_diff>
--- a/Documentation/WORD/Sprint14_Task129_CriarPrototipoFinanceiro.docx
+++ b/Documentation/WORD/Sprint14_Task129_CriarPrototipoFinanceiro.docx
@@ -1151,7 +1151,8 @@
     <w:p>
       <w:pPr>
         <w:rPr>
-          <w:rFonts w:ascii="Segoe UI Emoji" w:hAnsi="Segoe UI Emoji" w:cs="Segoe UI Emoji"/>
+          <w:rFonts w:hint="default" w:ascii="Segoe UI Emoji" w:hAnsi="Segoe UI Emoji" w:cs="Segoe UI Emoji"/>
+          <w:lang w:val="pt-BR"/>
         </w:rPr>
       </w:pPr>
       <w:r>
@@ -1160,6 +1161,15 @@
         </w:rPr>
         <w:t>Pessoa 2: prototipação + definição de fluxo e microinterações.</w:t>
       </w:r>
+      <w:r>
+        <w:rPr>
+          <w:rFonts w:hint="default" w:ascii="Segoe UI Emoji" w:hAnsi="Segoe UI Emoji" w:cs="Segoe UI Emoji"/>
+          <w:lang w:val="pt-BR"/>
+        </w:rPr>
+        <w:t xml:space="preserve"> </w:t>
+      </w:r>
+      <w:bookmarkStart w:id="0" w:name="_GoBack"/>
+      <w:bookmarkEnd w:id="0"/>
     </w:p>
     <w:p>
       <w:pPr>
@@ -1463,8 +1473,6 @@
         </w:rPr>
         <w:t>Assinaturas</w:t>
       </w:r>
-      <w:bookmarkStart w:id="0" w:name="_GoBack"/>
-      <w:bookmarkEnd w:id="0"/>
     </w:p>
     <w:sectPr>
       <w:pgSz w:w="11906" w:h="16838"/>
@@ -1629,7 +1637,7 @@
     <w:lsdException w:uiPriority="99" w:name="Document Map"/>
     <w:lsdException w:uiPriority="99" w:name="Plain Text"/>
     <w:lsdException w:uiPriority="99" w:name="E-mail Signature"/>
-    <w:lsdException w:uiPriority="99" w:name="Normal (Web)"/>
+    <w:lsdException w:qFormat="1" w:uiPriority="99" w:name="Normal (Web)"/>
     <w:lsdException w:uiPriority="99" w:name="HTML Acronym"/>
     <w:lsdException w:uiPriority="99" w:name="HTML Address"/>
     <w:lsdException w:uiPriority="99" w:name="HTML Cite"/>
@@ -2018,6 +2026,7 @@
     <w:name w:val="Normal (Web)"/>
     <w:semiHidden/>
     <w:unhideWhenUsed/>
+    <w:qFormat/>
     <w:uiPriority w:val="99"/>
     <w:pPr>
       <w:spacing w:before="0" w:beforeAutospacing="1" w:after="0" w:afterAutospacing="1"/>

</xml_diff>